<commit_message>
Spiekbriefje en klad leerlingenhandleiding
</commit_message>
<xml_diff>
--- a/Handleidingen/Borduren - begeleidershandleiding v0.2.docx
+++ b/Handleidingen/Borduren - begeleidershandleiding v0.2.docx
@@ -35,7 +35,23 @@
           <w:szCs w:val="96"/>
           <w:lang w:val="nl-NL"/>
         </w:rPr>
-        <w:t>Dit document is in voorbereiding. Zal definitief zijn op uiterlijk donderdag 4 december. Begeleiders krijgen bericht.</w:t>
+        <w:t>Dit document is in voorbereiding</w:t>
+      </w:r>
+      <w:r>
+        <w:rPr>
+          <w:sz w:val="96"/>
+          <w:szCs w:val="96"/>
+          <w:lang w:val="nl-NL"/>
+        </w:rPr>
+        <w:t xml:space="preserve"> maar zal niet voor 7 december beschikbaar zijn. Alternatief is er het Spiekbriefje. </w:t>
+      </w:r>
+      <w:r>
+        <w:rPr>
+          <w:sz w:val="96"/>
+          <w:szCs w:val="96"/>
+          <w:lang w:val="nl-NL"/>
+        </w:rPr>
+        <w:t>december. Begeleiders krijgen bericht.</w:t>
       </w:r>
     </w:p>
     <w:p>
@@ -43,6 +59,7 @@
         <w:pStyle w:val="Heading1"/>
       </w:pPr>
       <w:r>
+        <w:lastRenderedPageBreak/>
         <w:t>Introductie</w:t>
       </w:r>
     </w:p>
@@ -144,13 +161,7 @@
         <w:rPr>
           <w:lang w:val="nl-NL"/>
         </w:rPr>
-        <w:t xml:space="preserve">Niet aansluiten op Wifi wegens </w:t>
-      </w:r>
-      <w:r>
-        <w:rPr>
-          <w:lang w:val="nl-NL"/>
-        </w:rPr>
-        <w:t>mogelijk dubbele systeemnamen</w:t>
+        <w:t>Niet aansluiten op Wifi wegens mogelijk dubbele systeemnamen</w:t>
       </w:r>
     </w:p>
     <w:p>
@@ -186,21 +197,7 @@
         <w:rPr>
           <w:lang w:val="nl-NL"/>
         </w:rPr>
-        <w:t>Open TurtleStitch en sleep de bestaande .</w:t>
-      </w:r>
-      <w:proofErr w:type="spellStart"/>
-      <w:r>
-        <w:rPr>
-          <w:lang w:val="nl-NL"/>
-        </w:rPr>
-        <w:t>mpx</w:t>
-      </w:r>
-      <w:proofErr w:type="spellEnd"/>
-      <w:r>
-        <w:rPr>
-          <w:lang w:val="nl-NL"/>
-        </w:rPr>
-        <w:t xml:space="preserve"> file in het code veld</w:t>
+        <w:t>Open TurtleStitch en sleep de bestaande .mpx file in het code veld</w:t>
       </w:r>
     </w:p>
     <w:p>
@@ -236,21 +233,7 @@
         <w:rPr>
           <w:lang w:val="nl-NL"/>
         </w:rPr>
-        <w:t xml:space="preserve">Extra opdrachten met extra </w:t>
-      </w:r>
-      <w:proofErr w:type="spellStart"/>
-      <w:r>
-        <w:rPr>
-          <w:lang w:val="nl-NL"/>
-        </w:rPr>
-        <w:t>library</w:t>
-      </w:r>
-      <w:proofErr w:type="spellEnd"/>
-      <w:r>
-        <w:rPr>
-          <w:lang w:val="nl-NL"/>
-        </w:rPr>
-        <w:t>, hoe importeren. Vulling</w:t>
+        <w:t>Extra opdrachten met extra library, hoe importeren. Vulling</w:t>
       </w:r>
     </w:p>
     <w:p>
@@ -304,30 +287,8 @@
         <w:rPr>
           <w:lang w:val="nl-NL"/>
         </w:rPr>
-        <w:t xml:space="preserve">Geen </w:t>
+        <w:t>Geen density warning</w:t>
       </w:r>
-      <w:proofErr w:type="spellStart"/>
-      <w:r>
-        <w:rPr>
-          <w:lang w:val="nl-NL"/>
-        </w:rPr>
-        <w:t>density</w:t>
-      </w:r>
-      <w:proofErr w:type="spellEnd"/>
-      <w:r>
-        <w:rPr>
-          <w:lang w:val="nl-NL"/>
-        </w:rPr>
-        <w:t xml:space="preserve"> </w:t>
-      </w:r>
-      <w:proofErr w:type="spellStart"/>
-      <w:r>
-        <w:rPr>
-          <w:lang w:val="nl-NL"/>
-        </w:rPr>
-        <w:t>warning</w:t>
-      </w:r>
-      <w:proofErr w:type="spellEnd"/>
     </w:p>
     <w:p>
       <w:pPr>
@@ -458,16 +419,8 @@
         <w:rPr>
           <w:lang w:val="nl-NL"/>
         </w:rPr>
-        <w:t xml:space="preserve">Vilt kiezen, naar voorbeelden, inleveren bij </w:t>
+        <w:t>Vilt kiezen, naar voorbeelden, inleveren bij borduurder</w:t>
       </w:r>
-      <w:proofErr w:type="spellStart"/>
-      <w:r>
-        <w:rPr>
-          <w:lang w:val="nl-NL"/>
-        </w:rPr>
-        <w:t>borduurder</w:t>
-      </w:r>
-      <w:proofErr w:type="spellEnd"/>
     </w:p>
     <w:p>
       <w:pPr>
@@ -491,16 +444,8 @@
         <w:rPr>
           <w:lang w:val="nl-NL"/>
         </w:rPr>
-        <w:t xml:space="preserve">Taken van </w:t>
+        <w:t>Taken van borduurder</w:t>
       </w:r>
-      <w:proofErr w:type="spellStart"/>
-      <w:r>
-        <w:rPr>
-          <w:lang w:val="nl-NL"/>
-        </w:rPr>
-        <w:t>borduurder</w:t>
-      </w:r>
-      <w:proofErr w:type="spellEnd"/>
     </w:p>
     <w:p>
       <w:pPr>

</xml_diff>